<commit_message>
fix: a11y improvements, code review fixes, and resume update
- Move Strong/ColorLink to module scope (prevent child remounts)
- Fix interactive <a> nested inside <button> in recommendation cards
- Add aria-expanded, aria-hidden to expandable cards
- Add prefers-reduced-motion support for shimmer animation
- Fix tag inconsistency (fullstack → full-stack)
- Add resume download link to closing section
- Update resume file
</commit_message>
<xml_diff>
--- a/public/cv/angelo_dias-resume.docx
+++ b/public/cv/angelo_dias-resume.docx
@@ -1,6 +1,6 @@
 
 <file path=word/document.xml><?xml version="1.0" encoding="utf-8"?>
-<w:document xmlns:mc="http://schemas.openxmlformats.org/markup-compatibility/2006" xmlns:o="urn:schemas-microsoft-com:office:office" xmlns:r="http://schemas.openxmlformats.org/officeDocument/2006/relationships" xmlns:m="http://schemas.openxmlformats.org/officeDocument/2006/math" xmlns:v="urn:schemas-microsoft-com:vml" xmlns:wp="http://schemas.openxmlformats.org/drawingml/2006/wordprocessingDrawing" xmlns:w10="urn:schemas-microsoft-com:office:word" xmlns:w="http://schemas.openxmlformats.org/wordprocessingml/2006/main" xmlns:wne="http://schemas.microsoft.com/office/word/2006/wordml" xmlns:sl="http://schemas.openxmlformats.org/schemaLibrary/2006/main" xmlns:a="http://schemas.openxmlformats.org/drawingml/2006/main" xmlns:pic="http://schemas.openxmlformats.org/drawingml/2006/picture" xmlns:c="http://schemas.openxmlformats.org/drawingml/2006/chart" xmlns:lc="http://schemas.openxmlformats.org/drawingml/2006/lockedCanvas" xmlns:dgm="http://schemas.openxmlformats.org/drawingml/2006/diagram" xmlns:wps="http://schemas.microsoft.com/office/word/2010/wordprocessingShape" xmlns:wpg="http://schemas.microsoft.com/office/word/2010/wordprocessingGroup" xmlns:w14="http://schemas.microsoft.com/office/word/2010/wordml" xmlns:w15="http://schemas.microsoft.com/office/word/2012/wordml">
+<w:document xmlns:mc="http://schemas.openxmlformats.org/markup-compatibility/2006" xmlns:o="urn:schemas-microsoft-com:office:office" xmlns:r="http://schemas.openxmlformats.org/officeDocument/2006/relationships" xmlns:m="http://schemas.openxmlformats.org/officeDocument/2006/math" xmlns:v="urn:schemas-microsoft-com:vml" xmlns:wp="http://schemas.openxmlformats.org/drawingml/2006/wordprocessingDrawing" xmlns:w10="urn:schemas-microsoft-com:office:word" xmlns:w="http://schemas.openxmlformats.org/wordprocessingml/2006/main" xmlns:wne="http://schemas.microsoft.com/office/word/2006/wordml" xmlns:sl="http://schemas.openxmlformats.org/schemaLibrary/2006/main" xmlns:a="http://schemas.openxmlformats.org/drawingml/2006/main" xmlns:pic="http://schemas.openxmlformats.org/drawingml/2006/picture" xmlns:c="http://schemas.openxmlformats.org/drawingml/2006/chart" xmlns:lc="http://schemas.openxmlformats.org/drawingml/2006/lockedCanvas" xmlns:dgm="http://schemas.openxmlformats.org/drawingml/2006/diagram" xmlns:wps="http://schemas.microsoft.com/office/word/2010/wordprocessingShape" xmlns:wpg="http://schemas.microsoft.com/office/word/2010/wordprocessingGroup" xmlns:w14="http://schemas.microsoft.com/office/word/2010/wordml" xmlns:w15="http://schemas.microsoft.com/office/word/2012/wordml" xmlns:w16="http://schemas.microsoft.com/office/word/2018/wordml" xmlns:w16cex="http://schemas.microsoft.com/office/word/2018/wordml/cex" xmlns:w16cid="http://schemas.microsoft.com/office/word/2016/wordml/cid" xmlns="http://schemas.microsoft.com/office/tasks/2019/documenttasks" xmlns:cr="http://schemas.microsoft.com/office/comments/2020/reactions">
   <w:body>
     <w:p>
       <w:pPr>
@@ -10,6 +10,7 @@
         <w:rPr>
           <w:rFonts w:ascii="Nunito" w:cs="Nunito" w:eastAsia="Nunito" w:hAnsi="Nunito"/>
           <w:b w:val="1"/>
+          <w:bCs w:val="1"/>
           <w:sz w:val="24"/>
           <w:szCs w:val="24"/>
         </w:rPr>
@@ -18,6 +19,7 @@
         <w:rPr>
           <w:rFonts w:ascii="Nunito" w:cs="Nunito" w:eastAsia="Nunito" w:hAnsi="Nunito"/>
           <w:b w:val="1"/>
+          <w:bCs w:val="1"/>
           <w:sz w:val="24"/>
           <w:szCs w:val="24"/>
           <w:rtl w:val="0"/>
@@ -144,12 +146,276 @@
         <w:ind w:firstLine="0"/>
         <w:rPr>
           <w:rFonts w:ascii="Nunito" w:cs="Nunito" w:eastAsia="Nunito" w:hAnsi="Nunito"/>
-        </w:rPr>
-      </w:pPr>
-      <w:r>
-        <w:rPr>
-          <w:rFonts w:ascii="Nunito" w:cs="Nunito" w:eastAsia="Nunito" w:hAnsi="Nunito"/>
           <w:b w:val="1"/>
+          <w:bCs w:val="1"/>
+        </w:rPr>
+      </w:pPr>
+      <w:r>
+        <w:rPr>
+          <w:rtl w:val="0"/>
+        </w:rPr>
+      </w:r>
+    </w:p>
+    <w:p>
+      <w:pPr>
+        <w:tabs>
+          <w:tab w:val="right" w:leader="none" w:pos="10200"/>
+        </w:tabs>
+        <w:spacing w:line="240" w:lineRule="auto"/>
+        <w:rPr>
+          <w:rFonts w:ascii="Nunito" w:cs="Nunito" w:eastAsia="Nunito" w:hAnsi="Nunito"/>
+        </w:rPr>
+      </w:pPr>
+      <w:r>
+        <w:rPr>
+          <w:rFonts w:ascii="Nunito" w:cs="Nunito" w:eastAsia="Nunito" w:hAnsi="Nunito"/>
+          <w:b w:val="1"/>
+          <w:bCs w:val="1"/>
+          <w:rtl w:val="0"/>
+        </w:rPr>
+        <w:t xml:space="preserve">Harvard Business School</w:t>
+        <w:tab/>
+      </w:r>
+      <w:r>
+        <w:rPr>
+          <w:rFonts w:ascii="Nunito" w:cs="Nunito" w:eastAsia="Nunito" w:hAnsi="Nunito"/>
+          <w:rtl w:val="0"/>
+        </w:rPr>
+        <w:t xml:space="preserve">Remote</w:t>
+      </w:r>
+    </w:p>
+    <w:p>
+      <w:pPr>
+        <w:tabs>
+          <w:tab w:val="right" w:leader="none" w:pos="10200"/>
+        </w:tabs>
+        <w:spacing w:line="240" w:lineRule="auto"/>
+        <w:rPr>
+          <w:rFonts w:ascii="Nunito" w:cs="Nunito" w:eastAsia="Nunito" w:hAnsi="Nunito"/>
+        </w:rPr>
+      </w:pPr>
+      <w:r>
+        <w:rPr>
+          <w:rFonts w:ascii="Nunito" w:cs="Nunito" w:eastAsia="Nunito" w:hAnsi="Nunito"/>
+          <w:rtl w:val="0"/>
+        </w:rPr>
+        <w:t xml:space="preserve">Technical Manager</w:t>
+        <w:tab/>
+        <w:t xml:space="preserve">November 2024 to Present</w:t>
+      </w:r>
+    </w:p>
+    <w:p>
+      <w:pPr>
+        <w:tabs>
+          <w:tab w:val="right" w:leader="none" w:pos="10200"/>
+        </w:tabs>
+        <w:spacing w:line="240" w:lineRule="auto"/>
+        <w:rPr>
+          <w:rFonts w:ascii="Nunito" w:cs="Nunito" w:eastAsia="Nunito" w:hAnsi="Nunito"/>
+        </w:rPr>
+      </w:pPr>
+      <w:hyperlink r:id="rId9">
+        <w:r>
+          <w:rPr>
+            <w:rFonts w:ascii="Nunito" w:cs="Nunito" w:eastAsia="Nunito" w:hAnsi="Nunito"/>
+            <w:color w:val="1155cc"/>
+            <w:u w:val="single"/>
+            <w:rtl w:val="0"/>
+          </w:rPr>
+          <w:t xml:space="preserve">hbs.edu</w:t>
+        </w:r>
+      </w:hyperlink>
+      <w:r>
+        <w:rPr>
+          <w:rFonts w:ascii="Nunito" w:cs="Nunito" w:eastAsia="Nunito" w:hAnsi="Nunito"/>
+          <w:rtl w:val="0"/>
+        </w:rPr>
+        <w:t xml:space="preserve"> </w:t>
+      </w:r>
+    </w:p>
+    <w:p>
+      <w:pPr>
+        <w:numPr>
+          <w:ilvl w:val="0"/>
+          <w:numId w:val="3"/>
+        </w:numPr>
+        <w:tabs>
+          <w:tab w:val="right" w:leader="none" w:pos="10200"/>
+        </w:tabs>
+        <w:spacing w:line="240" w:lineRule="auto"/>
+        <w:ind w:left="283.46456692913375" w:hanging="285"/>
+        <w:rPr>
+          <w:rFonts w:ascii="Nunito" w:cs="Nunito" w:eastAsia="Nunito" w:hAnsi="Nunito"/>
+        </w:rPr>
+      </w:pPr>
+      <w:r>
+        <w:rPr>
+          <w:rFonts w:ascii="Nunito" w:cs="Nunito" w:eastAsia="Nunito" w:hAnsi="Nunito"/>
+          <w:rtl w:val="0"/>
+        </w:rPr>
+        <w:t xml:space="preserve">Lead the content migration of HBS's web ecosystem to Contentful, including </w:t>
+      </w:r>
+      <w:hyperlink r:id="rId10">
+        <w:r>
+          <w:rPr>
+            <w:rFonts w:ascii="Nunito" w:cs="Nunito" w:eastAsia="Nunito" w:hAnsi="Nunito"/>
+            <w:color w:val="1155cc"/>
+            <w:u w:val="single"/>
+            <w:rtl w:val="0"/>
+          </w:rPr>
+          <w:t xml:space="preserve">HBS Online’s Course Finder</w:t>
+        </w:r>
+      </w:hyperlink>
+      <w:r>
+        <w:rPr>
+          <w:rFonts w:ascii="Nunito" w:cs="Nunito" w:eastAsia="Nunito" w:hAnsi="Nunito"/>
+          <w:rtl w:val="0"/>
+        </w:rPr>
+        <w:t xml:space="preserve"> and multiple Intranet sites, using the Contentful JavaScript SDK for migrations and content modeling;</w:t>
+      </w:r>
+    </w:p>
+    <w:p>
+      <w:pPr>
+        <w:numPr>
+          <w:ilvl w:val="0"/>
+          <w:numId w:val="3"/>
+        </w:numPr>
+        <w:tabs>
+          <w:tab w:val="right" w:leader="none" w:pos="10200"/>
+        </w:tabs>
+        <w:spacing w:line="240" w:lineRule="auto"/>
+        <w:ind w:left="283.46456692913375" w:hanging="285"/>
+        <w:rPr>
+          <w:rFonts w:ascii="Nunito" w:cs="Nunito" w:eastAsia="Nunito" w:hAnsi="Nunito"/>
+        </w:rPr>
+      </w:pPr>
+      <w:r>
+        <w:rPr>
+          <w:rFonts w:ascii="Nunito" w:cs="Nunito" w:eastAsia="Nunito" w:hAnsi="Nunito"/>
+          <w:rtl w:val="0"/>
+        </w:rPr>
+        <w:t xml:space="preserve">Architect and create content models, build components with Next.js and TypeScript, and maintain HBS's production sites;</w:t>
+      </w:r>
+    </w:p>
+    <w:p>
+      <w:pPr>
+        <w:numPr>
+          <w:ilvl w:val="0"/>
+          <w:numId w:val="3"/>
+        </w:numPr>
+        <w:tabs>
+          <w:tab w:val="right" w:leader="none" w:pos="10200"/>
+        </w:tabs>
+        <w:spacing w:line="240" w:lineRule="auto"/>
+        <w:ind w:left="283.46456692913375" w:hanging="285"/>
+        <w:rPr>
+          <w:rFonts w:ascii="Nunito" w:cs="Nunito" w:eastAsia="Nunito" w:hAnsi="Nunito"/>
+        </w:rPr>
+      </w:pPr>
+      <w:r>
+        <w:rPr>
+          <w:rFonts w:ascii="Nunito" w:cs="Nunito" w:eastAsia="Nunito" w:hAnsi="Nunito"/>
+          <w:rtl w:val="0"/>
+        </w:rPr>
+        <w:t xml:space="preserve">Manage and grow the technical team — trained and onboarded developers (both employees and contractors), support QA integration, and directly mentor an employee from another project;</w:t>
+      </w:r>
+    </w:p>
+    <w:p>
+      <w:pPr>
+        <w:numPr>
+          <w:ilvl w:val="0"/>
+          <w:numId w:val="3"/>
+        </w:numPr>
+        <w:tabs>
+          <w:tab w:val="right" w:leader="none" w:pos="10200"/>
+        </w:tabs>
+        <w:spacing w:line="240" w:lineRule="auto"/>
+        <w:ind w:left="283.46456692913375" w:hanging="285"/>
+        <w:rPr>
+          <w:rFonts w:ascii="Nunito" w:cs="Nunito" w:eastAsia="Nunito" w:hAnsi="Nunito"/>
+        </w:rPr>
+      </w:pPr>
+      <w:r>
+        <w:rPr>
+          <w:rFonts w:ascii="Nunito" w:cs="Nunito" w:eastAsia="Nunito" w:hAnsi="Nunito"/>
+          <w:rtl w:val="0"/>
+        </w:rPr>
+        <w:t xml:space="preserve">Author Knowledge Base articles to document processes and ensure knowledge sharing across teams;</w:t>
+      </w:r>
+    </w:p>
+    <w:p>
+      <w:pPr>
+        <w:numPr>
+          <w:ilvl w:val="0"/>
+          <w:numId w:val="3"/>
+        </w:numPr>
+        <w:tabs>
+          <w:tab w:val="right" w:leader="none" w:pos="10200"/>
+        </w:tabs>
+        <w:spacing w:line="240" w:lineRule="auto"/>
+        <w:ind w:left="283.46456692913375" w:hanging="285"/>
+        <w:rPr>
+          <w:rFonts w:ascii="Nunito" w:cs="Nunito" w:eastAsia="Nunito" w:hAnsi="Nunito"/>
+        </w:rPr>
+      </w:pPr>
+      <w:r>
+        <w:rPr>
+          <w:rFonts w:ascii="Nunito" w:cs="Nunito" w:eastAsia="Nunito" w:hAnsi="Nunito"/>
+          <w:rtl w:val="0"/>
+        </w:rPr>
+        <w:t xml:space="preserve">Worked in the project while employed by Appnovation (</w:t>
+      </w:r>
+      <w:hyperlink r:id="rId11">
+        <w:r>
+          <w:rPr>
+            <w:rFonts w:ascii="Nunito" w:cs="Nunito" w:eastAsia="Nunito" w:hAnsi="Nunito"/>
+            <w:color w:val="1155cc"/>
+            <w:u w:val="single"/>
+            <w:rtl w:val="0"/>
+          </w:rPr>
+          <w:t xml:space="preserve">appnovation.com</w:t>
+        </w:r>
+      </w:hyperlink>
+      <w:r>
+        <w:rPr>
+          <w:rFonts w:ascii="Nunito" w:cs="Nunito" w:eastAsia="Nunito" w:hAnsi="Nunito"/>
+          <w:rtl w:val="0"/>
+        </w:rPr>
+        <w:t xml:space="preserve">).</w:t>
+      </w:r>
+    </w:p>
+    <w:p>
+      <w:pPr>
+        <w:tabs>
+          <w:tab w:val="right" w:leader="none" w:pos="10200"/>
+        </w:tabs>
+        <w:spacing w:line="240" w:lineRule="auto"/>
+        <w:rPr>
+          <w:rFonts w:ascii="Nunito" w:cs="Nunito" w:eastAsia="Nunito" w:hAnsi="Nunito"/>
+        </w:rPr>
+      </w:pPr>
+      <w:r>
+        <w:rPr>
+          <w:rtl w:val="0"/>
+        </w:rPr>
+      </w:r>
+    </w:p>
+    <w:p>
+      <w:pPr>
+        <w:tabs>
+          <w:tab w:val="right" w:leader="none" w:pos="10200"/>
+        </w:tabs>
+        <w:spacing w:line="240" w:lineRule="auto"/>
+        <w:ind w:firstLine="0"/>
+        <w:rPr>
+          <w:rFonts w:ascii="Nunito" w:cs="Nunito" w:eastAsia="Nunito" w:hAnsi="Nunito"/>
+        </w:rPr>
+      </w:pPr>
+      <w:r>
+        <w:rPr>
+          <w:rFonts w:ascii="Nunito" w:cs="Nunito" w:eastAsia="Nunito" w:hAnsi="Nunito"/>
+          <w:b w:val="1"/>
+          <w:bCs w:val="1"/>
           <w:rtl w:val="0"/>
         </w:rPr>
         <w:t xml:space="preserve">HUK Autoservice GmbH</w:t>
@@ -206,7 +472,7 @@
           <w:rFonts w:ascii="Nunito" w:cs="Nunito" w:eastAsia="Nunito" w:hAnsi="Nunito"/>
         </w:rPr>
       </w:pPr>
-      <w:hyperlink r:id="rId9">
+      <w:hyperlink r:id="rId12">
         <w:r>
           <w:rPr>
             <w:rFonts w:ascii="Nunito" w:cs="Nunito" w:eastAsia="Nunito" w:hAnsi="Nunito"/>
@@ -229,7 +495,7 @@
       <w:pPr>
         <w:numPr>
           <w:ilvl w:val="0"/>
-          <w:numId w:val="5"/>
+          <w:numId w:val="3"/>
         </w:numPr>
         <w:tabs>
           <w:tab w:val="right" w:leader="none" w:pos="10200"/>
@@ -271,7 +537,7 @@
       <w:pPr>
         <w:numPr>
           <w:ilvl w:val="0"/>
-          <w:numId w:val="5"/>
+          <w:numId w:val="3"/>
         </w:numPr>
         <w:tabs>
           <w:tab w:val="right" w:leader="none" w:pos="10200"/>
@@ -294,7 +560,7 @@
       <w:pPr>
         <w:numPr>
           <w:ilvl w:val="0"/>
-          <w:numId w:val="5"/>
+          <w:numId w:val="3"/>
         </w:numPr>
         <w:tabs>
           <w:tab w:val="right" w:leader="none" w:pos="10200"/>
@@ -313,7 +579,7 @@
         </w:rPr>
         <w:t xml:space="preserve">Worked in the project while employed by foobar Agency GmbH (</w:t>
       </w:r>
-      <w:hyperlink r:id="rId10">
+      <w:hyperlink r:id="rId13">
         <w:r>
           <w:rPr>
             <w:rFonts w:ascii="Nunito" w:cs="Nunito" w:eastAsia="Nunito" w:hAnsi="Nunito"/>
@@ -369,6 +635,7 @@
         <w:rPr>
           <w:rFonts w:ascii="Nunito" w:cs="Nunito" w:eastAsia="Nunito" w:hAnsi="Nunito"/>
           <w:b w:val="1"/>
+          <w:bCs w:val="1"/>
           <w:rtl w:val="0"/>
         </w:rPr>
         <w:t xml:space="preserve">Metadados</w:t>
@@ -419,7 +686,7 @@
           <w:rFonts w:ascii="Nunito" w:cs="Nunito" w:eastAsia="Nunito" w:hAnsi="Nunito"/>
         </w:rPr>
       </w:pPr>
-      <w:hyperlink r:id="rId11">
+      <w:hyperlink r:id="rId14">
         <w:r>
           <w:rPr>
             <w:rFonts w:ascii="Nunito" w:cs="Nunito" w:eastAsia="Nunito" w:hAnsi="Nunito"/>
@@ -447,7 +714,7 @@
       <w:pPr>
         <w:numPr>
           <w:ilvl w:val="0"/>
-          <w:numId w:val="2"/>
+          <w:numId w:val="4"/>
         </w:numPr>
         <w:tabs>
           <w:tab w:val="right" w:leader="none" w:pos="10200"/>
@@ -471,7 +738,7 @@
       <w:pPr>
         <w:numPr>
           <w:ilvl w:val="0"/>
-          <w:numId w:val="2"/>
+          <w:numId w:val="4"/>
         </w:numPr>
         <w:tabs>
           <w:tab w:val="right" w:leader="none" w:pos="10200"/>
@@ -495,7 +762,7 @@
       <w:pPr>
         <w:numPr>
           <w:ilvl w:val="0"/>
-          <w:numId w:val="2"/>
+          <w:numId w:val="4"/>
         </w:numPr>
         <w:tabs>
           <w:tab w:val="right" w:leader="none" w:pos="10200"/>
@@ -514,7 +781,7 @@
         </w:rPr>
         <w:t xml:space="preserve">Worked in the project while employed by Seasoned (</w:t>
       </w:r>
-      <w:hyperlink r:id="rId12">
+      <w:hyperlink r:id="rId15">
         <w:r>
           <w:rPr>
             <w:rFonts w:ascii="Nunito" w:cs="Nunito" w:eastAsia="Nunito" w:hAnsi="Nunito"/>
@@ -539,157 +806,51 @@
           <w:tab w:val="right" w:leader="none" w:pos="10200"/>
         </w:tabs>
         <w:spacing w:line="240" w:lineRule="auto"/>
+        <w:ind w:left="0" w:firstLine="0"/>
+        <w:rPr>
+          <w:rFonts w:ascii="Nunito" w:cs="Nunito" w:eastAsia="Nunito" w:hAnsi="Nunito"/>
+        </w:rPr>
+      </w:pPr>
+      <w:r>
+        <w:rPr>
+          <w:rtl w:val="0"/>
+        </w:rPr>
+      </w:r>
+    </w:p>
+    <w:p>
+      <w:pPr>
+        <w:tabs>
+          <w:tab w:val="right" w:leader="none" w:pos="10200"/>
+        </w:tabs>
+        <w:spacing w:line="240" w:lineRule="auto"/>
         <w:ind w:firstLine="0"/>
         <w:rPr>
           <w:rFonts w:ascii="Nunito" w:cs="Nunito" w:eastAsia="Nunito" w:hAnsi="Nunito"/>
+        </w:rPr>
+      </w:pPr>
+      <w:r>
+        <w:rPr>
+          <w:rFonts w:ascii="Nunito" w:cs="Nunito" w:eastAsia="Nunito" w:hAnsi="Nunito"/>
           <w:b w:val="1"/>
-        </w:rPr>
-      </w:pPr>
-      <w:r>
-        <w:rPr>
-          <w:rtl w:val="0"/>
-        </w:rPr>
-      </w:r>
-    </w:p>
-    <w:p>
-      <w:pPr>
-        <w:tabs>
-          <w:tab w:val="right" w:leader="none" w:pos="10200"/>
-        </w:tabs>
-        <w:spacing w:line="240" w:lineRule="auto"/>
-        <w:ind w:firstLine="0"/>
-        <w:rPr>
-          <w:rFonts w:ascii="Nunito" w:cs="Nunito" w:eastAsia="Nunito" w:hAnsi="Nunito"/>
-        </w:rPr>
-      </w:pPr>
+          <w:bCs w:val="1"/>
+          <w:rtl w:val="0"/>
+        </w:rPr>
+        <w:t xml:space="preserve">Folha de S</w:t>
+      </w:r>
       <w:r>
         <w:rPr>
           <w:rFonts w:ascii="Nunito" w:cs="Nunito" w:eastAsia="Nunito" w:hAnsi="Nunito"/>
           <w:b w:val="1"/>
-          <w:rtl w:val="0"/>
-        </w:rPr>
-        <w:t xml:space="preserve">Freelancer</w:t>
-        <w:tab/>
-      </w:r>
-      <w:r>
-        <w:rPr>
-          <w:rFonts w:ascii="Nunito" w:cs="Nunito" w:eastAsia="Nunito" w:hAnsi="Nunito"/>
-          <w:rtl w:val="0"/>
-        </w:rPr>
-        <w:t xml:space="preserve">Remote</w:t>
-      </w:r>
-      <w:r>
-        <w:rPr>
-          <w:rtl w:val="0"/>
-        </w:rPr>
-      </w:r>
-    </w:p>
-    <w:p>
-      <w:pPr>
-        <w:tabs>
-          <w:tab w:val="right" w:leader="none" w:pos="10200"/>
-        </w:tabs>
-        <w:spacing w:line="240" w:lineRule="auto"/>
-        <w:ind w:firstLine="0"/>
-        <w:rPr>
-          <w:rFonts w:ascii="Nunito" w:cs="Nunito" w:eastAsia="Nunito" w:hAnsi="Nunito"/>
-        </w:rPr>
-      </w:pPr>
-      <w:r>
-        <w:rPr>
-          <w:rFonts w:ascii="Nunito" w:cs="Nunito" w:eastAsia="Nunito" w:hAnsi="Nunito"/>
-          <w:rtl w:val="0"/>
-        </w:rPr>
-        <w:t xml:space="preserve">Front End Developer</w:t>
-      </w:r>
-      <w:r>
-        <w:rPr>
-          <w:rFonts w:ascii="Nunito" w:cs="Nunito" w:eastAsia="Nunito" w:hAnsi="Nunito"/>
-          <w:i w:val="1"/>
-          <w:rtl w:val="0"/>
-        </w:rPr>
-        <w:tab/>
-      </w:r>
-      <w:r>
-        <w:rPr>
-          <w:rFonts w:ascii="Nunito" w:cs="Nunito" w:eastAsia="Nunito" w:hAnsi="Nunito"/>
-          <w:rtl w:val="0"/>
-        </w:rPr>
-        <w:t xml:space="preserve">February 2019 to January 2021</w:t>
-      </w:r>
-    </w:p>
-    <w:p>
-      <w:pPr>
-        <w:numPr>
-          <w:ilvl w:val="0"/>
-          <w:numId w:val="3"/>
-        </w:numPr>
-        <w:tabs>
-          <w:tab w:val="right" w:leader="none" w:pos="10200"/>
-        </w:tabs>
-        <w:spacing w:line="240" w:lineRule="auto"/>
-        <w:ind w:left="283.46456692913375" w:hanging="283.46456692913375"/>
-        <w:rPr>
-          <w:rFonts w:ascii="Nunito" w:cs="Nunito" w:eastAsia="Nunito" w:hAnsi="Nunito"/>
-          <w:u w:val="none"/>
-        </w:rPr>
-      </w:pPr>
-      <w:r>
-        <w:rPr>
-          <w:rFonts w:ascii="Nunito" w:cs="Nunito" w:eastAsia="Nunito" w:hAnsi="Nunito"/>
-          <w:rtl w:val="0"/>
-        </w:rPr>
-        <w:t xml:space="preserve">Designed and developed web and mobile solutions for communication &amp; newspaper companies;</w:t>
-      </w:r>
-    </w:p>
-    <w:p>
-      <w:pPr>
-        <w:tabs>
-          <w:tab w:val="right" w:leader="none" w:pos="10200"/>
-        </w:tabs>
-        <w:spacing w:line="240" w:lineRule="auto"/>
-        <w:ind w:left="0" w:firstLine="0"/>
-        <w:rPr>
-          <w:rFonts w:ascii="Nunito" w:cs="Nunito" w:eastAsia="Nunito" w:hAnsi="Nunito"/>
-        </w:rPr>
-      </w:pPr>
-      <w:r>
-        <w:rPr>
-          <w:rtl w:val="0"/>
-        </w:rPr>
-      </w:r>
-    </w:p>
-    <w:p>
-      <w:pPr>
-        <w:tabs>
-          <w:tab w:val="right" w:leader="none" w:pos="10200"/>
-        </w:tabs>
-        <w:spacing w:line="240" w:lineRule="auto"/>
-        <w:ind w:firstLine="0"/>
-        <w:rPr>
-          <w:rFonts w:ascii="Nunito" w:cs="Nunito" w:eastAsia="Nunito" w:hAnsi="Nunito"/>
-        </w:rPr>
-      </w:pPr>
+          <w:bCs w:val="1"/>
+          <w:rtl w:val="0"/>
+        </w:rPr>
+        <w:t xml:space="preserve">.</w:t>
+      </w:r>
       <w:r>
         <w:rPr>
           <w:rFonts w:ascii="Nunito" w:cs="Nunito" w:eastAsia="Nunito" w:hAnsi="Nunito"/>
           <w:b w:val="1"/>
-          <w:rtl w:val="0"/>
-        </w:rPr>
-        <w:t xml:space="preserve">Folha de S</w:t>
-      </w:r>
-      <w:r>
-        <w:rPr>
-          <w:rFonts w:ascii="Nunito" w:cs="Nunito" w:eastAsia="Nunito" w:hAnsi="Nunito"/>
-          <w:b w:val="1"/>
-          <w:rtl w:val="0"/>
-        </w:rPr>
-        <w:t xml:space="preserve">.</w:t>
-      </w:r>
-      <w:r>
-        <w:rPr>
-          <w:rFonts w:ascii="Nunito" w:cs="Nunito" w:eastAsia="Nunito" w:hAnsi="Nunito"/>
-          <w:b w:val="1"/>
+          <w:bCs w:val="1"/>
           <w:rtl w:val="0"/>
         </w:rPr>
         <w:t xml:space="preserve"> Paulo Newspaper</w:t>
@@ -713,19 +874,21 @@
         <w:rPr>
           <w:rFonts w:ascii="Nunito" w:cs="Nunito" w:eastAsia="Nunito" w:hAnsi="Nunito"/>
           <w:b w:val="1"/>
-        </w:rPr>
-      </w:pPr>
-      <w:r>
-        <w:rPr>
-          <w:rFonts w:ascii="Nunito" w:cs="Nunito" w:eastAsia="Nunito" w:hAnsi="Nunito"/>
-          <w:rtl w:val="0"/>
-        </w:rPr>
-        <w:t xml:space="preserve">Front End Developer</w:t>
+          <w:bCs w:val="1"/>
+        </w:rPr>
+      </w:pPr>
+      <w:r>
+        <w:rPr>
+          <w:rFonts w:ascii="Nunito" w:cs="Nunito" w:eastAsia="Nunito" w:hAnsi="Nunito"/>
+          <w:rtl w:val="0"/>
+        </w:rPr>
+        <w:t xml:space="preserve">Front End Developer &amp; Designer</w:t>
       </w:r>
       <w:r>
         <w:rPr>
           <w:rFonts w:ascii="Nunito" w:cs="Nunito" w:eastAsia="Nunito" w:hAnsi="Nunito"/>
           <w:i w:val="1"/>
+          <w:iCs w:val="1"/>
           <w:rtl w:val="0"/>
         </w:rPr>
         <w:tab/>
@@ -754,7 +917,7 @@
           <w:rFonts w:ascii="Nunito" w:cs="Nunito" w:eastAsia="Nunito" w:hAnsi="Nunito"/>
         </w:rPr>
       </w:pPr>
-      <w:hyperlink r:id="rId13">
+      <w:hyperlink r:id="rId16">
         <w:r>
           <w:rPr>
             <w:rFonts w:ascii="Nunito" w:cs="Nunito" w:eastAsia="Nunito" w:hAnsi="Nunito"/>
@@ -775,7 +938,7 @@
       <w:pPr>
         <w:numPr>
           <w:ilvl w:val="0"/>
-          <w:numId w:val="1"/>
+          <w:numId w:val="2"/>
         </w:numPr>
         <w:tabs>
           <w:tab w:val="right" w:leader="none" w:pos="10200"/>
@@ -792,6 +955,91 @@
           <w:rtl w:val="0"/>
         </w:rPr>
         <w:t xml:space="preserve">Designed and developed award-winning publications at Latin America’s biggest newspaper, solving particular technological challenges;</w:t>
+      </w:r>
+    </w:p>
+    <w:p>
+      <w:pPr>
+        <w:numPr>
+          <w:ilvl w:val="0"/>
+          <w:numId w:val="2"/>
+        </w:numPr>
+        <w:tabs>
+          <w:tab w:val="right" w:leader="none" w:pos="10200"/>
+        </w:tabs>
+        <w:spacing w:line="240" w:lineRule="auto"/>
+        <w:ind w:left="283.46456692913375" w:hanging="283.46456692913375"/>
+        <w:rPr>
+          <w:rFonts w:ascii="Nunito" w:cs="Nunito" w:eastAsia="Nunito" w:hAnsi="Nunito"/>
+        </w:rPr>
+      </w:pPr>
+      <w:r>
+        <w:rPr>
+          <w:rFonts w:ascii="Nunito" w:cs="Nunito" w:eastAsia="Nunito" w:hAnsi="Nunito"/>
+          <w:rtl w:val="0"/>
+        </w:rPr>
+        <w:t xml:space="preserve">Created internal tools, solved workflow problems, and applied Agile management techniques to optimize the newspaper team’s work.</w:t>
+      </w:r>
+    </w:p>
+    <w:p>
+      <w:pPr>
+        <w:numPr>
+          <w:ilvl w:val="0"/>
+          <w:numId w:val="2"/>
+        </w:numPr>
+        <w:tabs>
+          <w:tab w:val="right" w:leader="none" w:pos="10200"/>
+        </w:tabs>
+        <w:spacing w:line="240" w:lineRule="auto"/>
+        <w:ind w:left="283.46456692913375" w:hanging="283.46456692913375"/>
+        <w:rPr>
+          <w:rFonts w:ascii="Nunito" w:cs="Nunito" w:eastAsia="Nunito" w:hAnsi="Nunito"/>
+          <w:u w:val="none"/>
+        </w:rPr>
+      </w:pPr>
+      <w:r>
+        <w:rPr>
+          <w:rFonts w:ascii="Nunito" w:cs="Nunito" w:eastAsia="Nunito" w:hAnsi="Nunito"/>
+          <w:rtl w:val="0"/>
+        </w:rPr>
+        <w:t xml:space="preserve">Worked as an infographics &amp; layout designer — designing pages ranging from the newspaper cover, through economy, sports, and politics sections, to smaller supplemental sections.</w:t>
+      </w:r>
+    </w:p>
+    <w:p>
+      <w:pPr>
+        <w:tabs>
+          <w:tab w:val="right" w:leader="none" w:pos="10200"/>
+        </w:tabs>
+        <w:spacing w:line="240" w:lineRule="auto"/>
+        <w:ind w:firstLine="0"/>
+        <w:rPr>
+          <w:rFonts w:ascii="Nunito" w:cs="Nunito" w:eastAsia="Nunito" w:hAnsi="Nunito"/>
+        </w:rPr>
+      </w:pPr>
+      <w:r>
+        <w:rPr>
+          <w:rtl w:val="0"/>
+        </w:rPr>
+      </w:r>
+    </w:p>
+    <w:p>
+      <w:pPr>
+        <w:tabs>
+          <w:tab w:val="right" w:leader="none" w:pos="10200"/>
+        </w:tabs>
+        <w:spacing w:line="240" w:lineRule="auto"/>
+        <w:jc w:val="center"/>
+        <w:rPr>
+          <w:rFonts w:ascii="Nunito" w:cs="Nunito" w:eastAsia="Nunito" w:hAnsi="Nunito"/>
+          <w:u w:val="single"/>
+        </w:rPr>
+      </w:pPr>
+      <w:r>
+        <w:rPr>
+          <w:rFonts w:ascii="Nunito" w:cs="Nunito" w:eastAsia="Nunito" w:hAnsi="Nunito"/>
+          <w:u w:val="single"/>
+          <w:rtl w:val="0"/>
+        </w:rPr>
+        <w:t xml:space="preserve">Certifications</w:t>
       </w:r>
     </w:p>
     <w:p>
@@ -804,26 +1052,73 @@
           <w:tab w:val="right" w:leader="none" w:pos="10200"/>
         </w:tabs>
         <w:spacing w:line="240" w:lineRule="auto"/>
-        <w:ind w:left="283.46456692913375" w:hanging="283.46456692913375"/>
-        <w:rPr>
-          <w:rFonts w:ascii="Nunito" w:cs="Nunito" w:eastAsia="Nunito" w:hAnsi="Nunito"/>
-        </w:rPr>
-      </w:pPr>
-      <w:r>
-        <w:rPr>
-          <w:rFonts w:ascii="Nunito" w:cs="Nunito" w:eastAsia="Nunito" w:hAnsi="Nunito"/>
-          <w:rtl w:val="0"/>
-        </w:rPr>
-        <w:t xml:space="preserve">Created internal tools, solved workflow problems, and applied Agile management techniques to optimize the newspaper team’s work.</w:t>
-      </w:r>
-    </w:p>
-    <w:p>
-      <w:pPr>
-        <w:tabs>
-          <w:tab w:val="right" w:leader="none" w:pos="10200"/>
-        </w:tabs>
-        <w:spacing w:line="240" w:lineRule="auto"/>
-        <w:ind w:firstLine="0"/>
+        <w:ind w:left="283.46456692913375"/>
+        <w:rPr>
+          <w:rFonts w:ascii="Nunito" w:cs="Nunito" w:eastAsia="Nunito" w:hAnsi="Nunito"/>
+        </w:rPr>
+      </w:pPr>
+      <w:r>
+        <w:rPr>
+          <w:rFonts w:ascii="Nunito" w:cs="Nunito" w:eastAsia="Nunito" w:hAnsi="Nunito"/>
+          <w:rtl w:val="0"/>
+        </w:rPr>
+        <w:t xml:space="preserve">Sanity Certified Content Operator (2025)</w:t>
+      </w:r>
+    </w:p>
+    <w:p>
+      <w:pPr>
+        <w:numPr>
+          <w:ilvl w:val="0"/>
+          <w:numId w:val="1"/>
+        </w:numPr>
+        <w:tabs>
+          <w:tab w:val="right" w:leader="none" w:pos="10200"/>
+        </w:tabs>
+        <w:spacing w:line="240" w:lineRule="auto"/>
+        <w:ind w:left="283.46456692913375"/>
+        <w:rPr>
+          <w:rFonts w:ascii="Nunito" w:cs="Nunito" w:eastAsia="Nunito" w:hAnsi="Nunito"/>
+        </w:rPr>
+      </w:pPr>
+      <w:r>
+        <w:rPr>
+          <w:rFonts w:ascii="Nunito" w:cs="Nunito" w:eastAsia="Nunito" w:hAnsi="Nunito"/>
+          <w:rtl w:val="0"/>
+        </w:rPr>
+        <w:t xml:space="preserve">Contentful Certified Professional (2024)</w:t>
+      </w:r>
+    </w:p>
+    <w:p>
+      <w:pPr>
+        <w:numPr>
+          <w:ilvl w:val="0"/>
+          <w:numId w:val="1"/>
+        </w:numPr>
+        <w:tabs>
+          <w:tab w:val="right" w:leader="none" w:pos="10200"/>
+        </w:tabs>
+        <w:spacing w:line="240" w:lineRule="auto"/>
+        <w:ind w:left="283.46456692913375"/>
+        <w:rPr>
+          <w:rFonts w:ascii="Nunito" w:cs="Nunito" w:eastAsia="Nunito" w:hAnsi="Nunito"/>
+          <w:u w:val="none"/>
+        </w:rPr>
+      </w:pPr>
+      <w:r>
+        <w:rPr>
+          <w:rFonts w:ascii="Nunito" w:cs="Nunito" w:eastAsia="Nunito" w:hAnsi="Nunito"/>
+          <w:rtl w:val="0"/>
+        </w:rPr>
+        <w:t xml:space="preserve">Professional Scrum Master (PSM1) (2021)</w:t>
+      </w:r>
+    </w:p>
+    <w:p>
+      <w:pPr>
+        <w:tabs>
+          <w:tab w:val="right" w:leader="none" w:pos="10200"/>
+        </w:tabs>
+        <w:spacing w:line="240" w:lineRule="auto"/>
+        <w:ind w:left="0" w:firstLine="0"/>
         <w:rPr>
           <w:rFonts w:ascii="Nunito" w:cs="Nunito" w:eastAsia="Nunito" w:hAnsi="Nunito"/>
         </w:rPr>
@@ -860,7 +1155,7 @@
       <w:pPr>
         <w:numPr>
           <w:ilvl w:val="0"/>
-          <w:numId w:val="4"/>
+          <w:numId w:val="1"/>
         </w:numPr>
         <w:tabs>
           <w:tab w:val="right" w:leader="none" w:pos="10200"/>
@@ -877,14 +1172,14 @@
           <w:rFonts w:ascii="Nunito" w:cs="Nunito" w:eastAsia="Nunito" w:hAnsi="Nunito"/>
           <w:rtl w:val="0"/>
         </w:rPr>
-        <w:t xml:space="preserve">Javascript - Typescript, React, NextJS, Redux, Node.js;</w:t>
+        <w:t xml:space="preserve">Javascript - Typescript, React, NextJS, Astro, Tanstack, Redux, Node.js;</w:t>
       </w:r>
     </w:p>
     <w:p>
       <w:pPr>
         <w:numPr>
           <w:ilvl w:val="0"/>
-          <w:numId w:val="4"/>
+          <w:numId w:val="1"/>
         </w:numPr>
         <w:tabs>
           <w:tab w:val="right" w:leader="none" w:pos="10200"/>
@@ -908,7 +1203,7 @@
       <w:pPr>
         <w:numPr>
           <w:ilvl w:val="0"/>
-          <w:numId w:val="4"/>
+          <w:numId w:val="1"/>
         </w:numPr>
         <w:tabs>
           <w:tab w:val="right" w:leader="none" w:pos="10200"/>
@@ -932,7 +1227,7 @@
       <w:pPr>
         <w:numPr>
           <w:ilvl w:val="0"/>
-          <w:numId w:val="4"/>
+          <w:numId w:val="1"/>
         </w:numPr>
         <w:tabs>
           <w:tab w:val="right" w:leader="none" w:pos="10200"/>
@@ -956,7 +1251,7 @@
       <w:pPr>
         <w:numPr>
           <w:ilvl w:val="0"/>
-          <w:numId w:val="4"/>
+          <w:numId w:val="1"/>
         </w:numPr>
         <w:tabs>
           <w:tab w:val="right" w:leader="none" w:pos="10200"/>
@@ -1073,15 +1368,91 @@
           <w:tab w:val="right" w:leader="none" w:pos="10200"/>
         </w:tabs>
         <w:spacing w:line="240" w:lineRule="auto"/>
+        <w:rPr>
+          <w:rFonts w:ascii="Nunito" w:cs="Nunito" w:eastAsia="Nunito" w:hAnsi="Nunito"/>
+        </w:rPr>
+      </w:pPr>
+      <w:r>
+        <w:rPr>
+          <w:rFonts w:ascii="Nunito" w:cs="Nunito" w:eastAsia="Nunito" w:hAnsi="Nunito"/>
+          <w:b w:val="1"/>
+          <w:bCs w:val="1"/>
+          <w:rtl w:val="0"/>
+        </w:rPr>
+        <w:t xml:space="preserve">Universidade de Mogi das Cruzes</w:t>
+      </w:r>
+      <w:r>
+        <w:rPr>
+          <w:rFonts w:ascii="Nunito" w:cs="Nunito" w:eastAsia="Nunito" w:hAnsi="Nunito"/>
+          <w:rtl w:val="0"/>
+        </w:rPr>
+        <w:t xml:space="preserve">       </w:t>
+        <w:tab/>
+        <w:t xml:space="preserve">          Mogi das Cruzes, Brazil</w:t>
+      </w:r>
+    </w:p>
+    <w:p>
+      <w:pPr>
+        <w:tabs>
+          <w:tab w:val="right" w:leader="none" w:pos="10200"/>
+        </w:tabs>
+        <w:spacing w:line="240" w:lineRule="auto"/>
+        <w:rPr>
+          <w:rFonts w:ascii="Nunito" w:cs="Nunito" w:eastAsia="Nunito" w:hAnsi="Nunito"/>
+          <w:b w:val="1"/>
+          <w:bCs w:val="1"/>
+        </w:rPr>
+      </w:pPr>
+      <w:r>
+        <w:rPr>
+          <w:rFonts w:ascii="Nunito" w:cs="Nunito" w:eastAsia="Nunito" w:hAnsi="Nunito"/>
+          <w:rtl w:val="0"/>
+        </w:rPr>
+        <w:t xml:space="preserve">Psychology</w:t>
+        <w:tab/>
+        <w:t xml:space="preserve">2024 - Ongoing</w:t>
+      </w:r>
+      <w:r>
+        <w:rPr>
+          <w:rtl w:val="0"/>
+        </w:rPr>
+      </w:r>
+    </w:p>
+    <w:p>
+      <w:pPr>
+        <w:tabs>
+          <w:tab w:val="right" w:leader="none" w:pos="10200"/>
+        </w:tabs>
+        <w:spacing w:line="240" w:lineRule="auto"/>
         <w:ind w:firstLine="0"/>
         <w:rPr>
           <w:rFonts w:ascii="Nunito" w:cs="Nunito" w:eastAsia="Nunito" w:hAnsi="Nunito"/>
-        </w:rPr>
-      </w:pPr>
-      <w:r>
-        <w:rPr>
-          <w:rFonts w:ascii="Nunito" w:cs="Nunito" w:eastAsia="Nunito" w:hAnsi="Nunito"/>
           <w:b w:val="1"/>
+          <w:bCs w:val="1"/>
+        </w:rPr>
+      </w:pPr>
+      <w:r>
+        <w:rPr>
+          <w:rtl w:val="0"/>
+        </w:rPr>
+      </w:r>
+    </w:p>
+    <w:p>
+      <w:pPr>
+        <w:tabs>
+          <w:tab w:val="right" w:leader="none" w:pos="10200"/>
+        </w:tabs>
+        <w:spacing w:line="240" w:lineRule="auto"/>
+        <w:ind w:firstLine="0"/>
+        <w:rPr>
+          <w:rFonts w:ascii="Nunito" w:cs="Nunito" w:eastAsia="Nunito" w:hAnsi="Nunito"/>
+        </w:rPr>
+      </w:pPr>
+      <w:r>
+        <w:rPr>
+          <w:rFonts w:ascii="Nunito" w:cs="Nunito" w:eastAsia="Nunito" w:hAnsi="Nunito"/>
+          <w:b w:val="1"/>
+          <w:bCs w:val="1"/>
           <w:rtl w:val="0"/>
         </w:rPr>
         <w:t xml:space="preserve">Universidade São Judas Tadeu</w:t>
@@ -1112,7 +1483,7 @@
         </w:rPr>
         <w:t xml:space="preserve">Social Communication, Journalism</w:t>
         <w:tab/>
-        <w:t xml:space="preserve">2012</w:t>
+        <w:t xml:space="preserve">2009 - 2012</w:t>
       </w:r>
       <w:r>
         <w:rPr>
@@ -1130,7 +1501,7 @@
 </file>
 
 <file path=word/numbering.xml><?xml version="1.0" encoding="utf-8"?>
-<w:numbering xmlns:mc="http://schemas.openxmlformats.org/markup-compatibility/2006" xmlns:o="urn:schemas-microsoft-com:office:office" xmlns:r="http://schemas.openxmlformats.org/officeDocument/2006/relationships" xmlns:m="http://schemas.openxmlformats.org/officeDocument/2006/math" xmlns:v="urn:schemas-microsoft-com:vml" xmlns:wp="http://schemas.openxmlformats.org/drawingml/2006/wordprocessingDrawing" xmlns:w10="urn:schemas-microsoft-com:office:word" xmlns:w="http://schemas.openxmlformats.org/wordprocessingml/2006/main" xmlns:wne="http://schemas.microsoft.com/office/word/2006/wordml" xmlns:sl="http://schemas.openxmlformats.org/schemaLibrary/2006/main" xmlns:a="http://schemas.openxmlformats.org/drawingml/2006/main" xmlns:pic="http://schemas.openxmlformats.org/drawingml/2006/picture" xmlns:c="http://schemas.openxmlformats.org/drawingml/2006/chart" xmlns:lc="http://schemas.openxmlformats.org/drawingml/2006/lockedCanvas" xmlns:dgm="http://schemas.openxmlformats.org/drawingml/2006/diagram" xmlns:wps="http://schemas.microsoft.com/office/word/2010/wordprocessingShape" xmlns:wpg="http://schemas.microsoft.com/office/word/2010/wordprocessingGroup" xmlns:w14="http://schemas.microsoft.com/office/word/2010/wordml" xmlns:w15="http://schemas.microsoft.com/office/word/2012/wordml">
+<w:numbering xmlns:mc="http://schemas.openxmlformats.org/markup-compatibility/2006" xmlns:o="urn:schemas-microsoft-com:office:office" xmlns:r="http://schemas.openxmlformats.org/officeDocument/2006/relationships" xmlns:m="http://schemas.openxmlformats.org/officeDocument/2006/math" xmlns:v="urn:schemas-microsoft-com:vml" xmlns:wp="http://schemas.openxmlformats.org/drawingml/2006/wordprocessingDrawing" xmlns:w10="urn:schemas-microsoft-com:office:word" xmlns:w="http://schemas.openxmlformats.org/wordprocessingml/2006/main" xmlns:wne="http://schemas.microsoft.com/office/word/2006/wordml" xmlns:sl="http://schemas.openxmlformats.org/schemaLibrary/2006/main" xmlns:a="http://schemas.openxmlformats.org/drawingml/2006/main" xmlns:pic="http://schemas.openxmlformats.org/drawingml/2006/picture" xmlns:c="http://schemas.openxmlformats.org/drawingml/2006/chart" xmlns:lc="http://schemas.openxmlformats.org/drawingml/2006/lockedCanvas" xmlns:dgm="http://schemas.openxmlformats.org/drawingml/2006/diagram" xmlns:wps="http://schemas.microsoft.com/office/word/2010/wordprocessingShape" xmlns:wpg="http://schemas.microsoft.com/office/word/2010/wordprocessingGroup" xmlns:w14="http://schemas.microsoft.com/office/word/2010/wordml" xmlns:w15="http://schemas.microsoft.com/office/word/2012/wordml" xmlns:w16="http://schemas.microsoft.com/office/word/2018/wordml" xmlns:w16cex="http://schemas.microsoft.com/office/word/2018/wordml/cex" xmlns:w16cid="http://schemas.microsoft.com/office/word/2016/wordml/cid" xmlns="http://schemas.microsoft.com/office/tasks/2019/documenttasks" xmlns:cr="http://schemas.microsoft.com/office/comments/2020/reactions">
   <w:abstractNum w:abstractNumId="1">
     <w:lvl w:ilvl="0">
       <w:start w:val="1"/>
@@ -1462,116 +1833,6 @@
     </w:lvl>
   </w:abstractNum>
   <w:abstractNum w:abstractNumId="4">
-    <w:lvl w:ilvl="0">
-      <w:start w:val="1"/>
-      <w:numFmt w:val="bullet"/>
-      <w:lvlText w:val="●"/>
-      <w:lvlJc w:val="left"/>
-      <w:pPr>
-        <w:ind w:left="720" w:hanging="360"/>
-      </w:pPr>
-      <w:rPr>
-        <w:u w:val="none"/>
-      </w:rPr>
-    </w:lvl>
-    <w:lvl w:ilvl="1">
-      <w:start w:val="1"/>
-      <w:numFmt w:val="bullet"/>
-      <w:lvlText w:val="○"/>
-      <w:lvlJc w:val="left"/>
-      <w:pPr>
-        <w:ind w:left="1440" w:hanging="360"/>
-      </w:pPr>
-      <w:rPr>
-        <w:u w:val="none"/>
-      </w:rPr>
-    </w:lvl>
-    <w:lvl w:ilvl="2">
-      <w:start w:val="1"/>
-      <w:numFmt w:val="bullet"/>
-      <w:lvlText w:val="■"/>
-      <w:lvlJc w:val="left"/>
-      <w:pPr>
-        <w:ind w:left="2160" w:hanging="360"/>
-      </w:pPr>
-      <w:rPr>
-        <w:u w:val="none"/>
-      </w:rPr>
-    </w:lvl>
-    <w:lvl w:ilvl="3">
-      <w:start w:val="1"/>
-      <w:numFmt w:val="bullet"/>
-      <w:lvlText w:val="●"/>
-      <w:lvlJc w:val="left"/>
-      <w:pPr>
-        <w:ind w:left="2880" w:hanging="360"/>
-      </w:pPr>
-      <w:rPr>
-        <w:u w:val="none"/>
-      </w:rPr>
-    </w:lvl>
-    <w:lvl w:ilvl="4">
-      <w:start w:val="1"/>
-      <w:numFmt w:val="bullet"/>
-      <w:lvlText w:val="○"/>
-      <w:lvlJc w:val="left"/>
-      <w:pPr>
-        <w:ind w:left="3600" w:hanging="360"/>
-      </w:pPr>
-      <w:rPr>
-        <w:u w:val="none"/>
-      </w:rPr>
-    </w:lvl>
-    <w:lvl w:ilvl="5">
-      <w:start w:val="1"/>
-      <w:numFmt w:val="bullet"/>
-      <w:lvlText w:val="■"/>
-      <w:lvlJc w:val="left"/>
-      <w:pPr>
-        <w:ind w:left="4320" w:hanging="360"/>
-      </w:pPr>
-      <w:rPr>
-        <w:u w:val="none"/>
-      </w:rPr>
-    </w:lvl>
-    <w:lvl w:ilvl="6">
-      <w:start w:val="1"/>
-      <w:numFmt w:val="bullet"/>
-      <w:lvlText w:val="●"/>
-      <w:lvlJc w:val="left"/>
-      <w:pPr>
-        <w:ind w:left="5040" w:hanging="360"/>
-      </w:pPr>
-      <w:rPr>
-        <w:u w:val="none"/>
-      </w:rPr>
-    </w:lvl>
-    <w:lvl w:ilvl="7">
-      <w:start w:val="1"/>
-      <w:numFmt w:val="bullet"/>
-      <w:lvlText w:val="○"/>
-      <w:lvlJc w:val="left"/>
-      <w:pPr>
-        <w:ind w:left="5760" w:hanging="360"/>
-      </w:pPr>
-      <w:rPr>
-        <w:u w:val="none"/>
-      </w:rPr>
-    </w:lvl>
-    <w:lvl w:ilvl="8">
-      <w:start w:val="1"/>
-      <w:numFmt w:val="bullet"/>
-      <w:lvlText w:val="■"/>
-      <w:lvlJc w:val="left"/>
-      <w:pPr>
-        <w:ind w:left="6480" w:hanging="360"/>
-      </w:pPr>
-      <w:rPr>
-        <w:u w:val="none"/>
-      </w:rPr>
-    </w:lvl>
-  </w:abstractNum>
-  <w:abstractNum w:abstractNumId="5">
     <w:lvl w:ilvl="0">
       <w:start w:val="1"/>
       <w:numFmt w:val="bullet"/>
@@ -1693,14 +1954,11 @@
   <w:num w:numId="4">
     <w:abstractNumId w:val="4"/>
   </w:num>
-  <w:num w:numId="5">
-    <w:abstractNumId w:val="5"/>
-  </w:num>
 </w:numbering>
 </file>
 
 <file path=word/styles.xml><?xml version="1.0" encoding="utf-8"?>
-<w:styles xmlns:mc="http://schemas.openxmlformats.org/markup-compatibility/2006" xmlns:o="urn:schemas-microsoft-com:office:office" xmlns:r="http://schemas.openxmlformats.org/officeDocument/2006/relationships" xmlns:m="http://schemas.openxmlformats.org/officeDocument/2006/math" xmlns:v="urn:schemas-microsoft-com:vml" xmlns:wp="http://schemas.openxmlformats.org/drawingml/2006/wordprocessingDrawing" xmlns:w10="urn:schemas-microsoft-com:office:word" xmlns:w="http://schemas.openxmlformats.org/wordprocessingml/2006/main" xmlns:wne="http://schemas.microsoft.com/office/word/2006/wordml" xmlns:sl="http://schemas.openxmlformats.org/schemaLibrary/2006/main" xmlns:a="http://schemas.openxmlformats.org/drawingml/2006/main" xmlns:pic="http://schemas.openxmlformats.org/drawingml/2006/picture" xmlns:c="http://schemas.openxmlformats.org/drawingml/2006/chart" xmlns:lc="http://schemas.openxmlformats.org/drawingml/2006/lockedCanvas" xmlns:dgm="http://schemas.openxmlformats.org/drawingml/2006/diagram" xmlns:wps="http://schemas.microsoft.com/office/word/2010/wordprocessingShape" xmlns:wpg="http://schemas.microsoft.com/office/word/2010/wordprocessingGroup" xmlns:w14="http://schemas.microsoft.com/office/word/2010/wordml" xmlns:w15="http://schemas.microsoft.com/office/word/2012/wordml">
+<w:styles xmlns:mc="http://schemas.openxmlformats.org/markup-compatibility/2006" xmlns:o="urn:schemas-microsoft-com:office:office" xmlns:r="http://schemas.openxmlformats.org/officeDocument/2006/relationships" xmlns:m="http://schemas.openxmlformats.org/officeDocument/2006/math" xmlns:v="urn:schemas-microsoft-com:vml" xmlns:wp="http://schemas.openxmlformats.org/drawingml/2006/wordprocessingDrawing" xmlns:w10="urn:schemas-microsoft-com:office:word" xmlns:w="http://schemas.openxmlformats.org/wordprocessingml/2006/main" xmlns:wne="http://schemas.microsoft.com/office/word/2006/wordml" xmlns:sl="http://schemas.openxmlformats.org/schemaLibrary/2006/main" xmlns:a="http://schemas.openxmlformats.org/drawingml/2006/main" xmlns:pic="http://schemas.openxmlformats.org/drawingml/2006/picture" xmlns:c="http://schemas.openxmlformats.org/drawingml/2006/chart" xmlns:lc="http://schemas.openxmlformats.org/drawingml/2006/lockedCanvas" xmlns:dgm="http://schemas.openxmlformats.org/drawingml/2006/diagram" xmlns:wps="http://schemas.microsoft.com/office/word/2010/wordprocessingShape" xmlns:wpg="http://schemas.microsoft.com/office/word/2010/wordprocessingGroup" xmlns:w14="http://schemas.microsoft.com/office/word/2010/wordml" xmlns:w15="http://schemas.microsoft.com/office/word/2012/wordml" xmlns:w16="http://schemas.microsoft.com/office/word/2018/wordml" xmlns:w16cex="http://schemas.microsoft.com/office/word/2018/wordml/cex" xmlns:w16cid="http://schemas.microsoft.com/office/word/2016/wordml/cid" xmlns="http://schemas.microsoft.com/office/tasks/2019/documenttasks" xmlns:cr="http://schemas.microsoft.com/office/comments/2020/reactions">
   <w:docDefaults>
     <w:rPrDefault>
       <w:rPr>
@@ -1716,11 +1974,19 @@
       </w:pPr>
     </w:pPrDefault>
   </w:docDefaults>
+  <w:style w:type="table" w:styleId="TableNormal" w:default="1">
+    <w:name w:val="TableNormal"/>
+    <w:tblPr>
+      <w:tblCellMar>
+        <w:top w:w="100.0" w:type="dxa"/>
+        <w:left w:w="100.0" w:type="dxa"/>
+        <w:bottom w:w="100.0" w:type="dxa"/>
+        <w:right w:w="100.0" w:type="dxa"/>
+      </w:tblCellMar>
+    </w:tblPr>
+  </w:style>
   <w:style w:type="paragraph" w:styleId="Normal" w:default="1">
     <w:name w:val="normal"/>
-  </w:style>
-  <w:style w:type="table" w:styleId="TableNormal" w:default="1">
-    <w:name w:val="Table Normal"/>
   </w:style>
   <w:style w:type="paragraph" w:styleId="Heading1">
     <w:name w:val="heading 1"/>
@@ -1749,6 +2015,7 @@
     </w:pPr>
     <w:rPr>
       <w:b w:val="0"/>
+      <w:bCs w:val="0"/>
       <w:sz w:val="32"/>
       <w:szCs w:val="32"/>
     </w:rPr>
@@ -1765,6 +2032,7 @@
     </w:pPr>
     <w:rPr>
       <w:b w:val="0"/>
+      <w:bCs w:val="0"/>
       <w:color w:val="434343"/>
       <w:sz w:val="28"/>
       <w:szCs w:val="28"/>
@@ -1814,6 +2082,7 @@
     </w:pPr>
     <w:rPr>
       <w:i w:val="1"/>
+      <w:iCs w:val="1"/>
       <w:color w:val="666666"/>
       <w:sz w:val="22"/>
       <w:szCs w:val="22"/>
@@ -1847,6 +2116,7 @@
     <w:rPr>
       <w:rFonts w:ascii="Arial" w:cs="Arial" w:eastAsia="Arial" w:hAnsi="Arial"/>
       <w:i w:val="0"/>
+      <w:iCs w:val="0"/>
       <w:color w:val="666666"/>
       <w:sz w:val="30"/>
       <w:szCs w:val="30"/>

</xml_diff>